<commit_message>
feat: Lam lai So do Use Case chi tiet tong the 6 phan he tac nghiep kem file thuyet minh chuyen sau cho GVHD
</commit_message>
<xml_diff>
--- a/Docs/BAO_CAO_NGHIEP_VU_VA_KIEN_TRUC_NOP_THAY.docx
+++ b/Docs/BAO_CAO_NGHIEP_VU_VA_KIEN_TRUC_NOP_THAY.docx
@@ -2269,7 +2269,7 @@
       <w:r>
         <w:drawing>
           <wp:inline xmlns:a="http://schemas.openxmlformats.org/drawingml/2006/main" xmlns:pic="http://schemas.openxmlformats.org/drawingml/2006/picture">
-            <wp:extent cx="5303520" cy="8771872"/>
+            <wp:extent cx="5303520" cy="6191138"/>
             <wp:docPr id="1" name="Picture 1"/>
             <wp:cNvGraphicFramePr>
               <a:graphicFrameLocks noChangeAspect="1"/>
@@ -2290,7 +2290,7 @@
                   <pic:spPr>
                     <a:xfrm>
                       <a:off x="0" y="0"/>
-                      <a:ext cx="5303520" cy="8771872"/>
+                      <a:ext cx="5303520" cy="6191138"/>
                     </a:xfrm>
                     <a:prstGeom prst="rect"/>
                   </pic:spPr>
@@ -2314,7 +2314,7 @@
           <w:color w:val="3C3C3C"/>
           <w:sz w:val="20"/>
         </w:rPr>
-        <w:t>Hình 1: Sơ đồ Use Case Hệ thống Quản trị Bán lẻ Chống lãng phí</w:t>
+        <w:t>Hình 1: Sơ đồ Use Case Hệ thống Quản trị Bán lẻ Chống lãng phí (Chi tiết 6 phân hệ tác nghiệp)</w:t>
       </w:r>
     </w:p>
     <w:p>
@@ -2452,7 +2452,7 @@
                 <w:color w:val="282828"/>
                 <w:sz w:val="20"/>
               </w:rPr>
-              <w:t>Đăng nhập hệ thống</w:t>
+              <w:t>Đăng nhập hệ thống (JWT)</w:t>
             </w:r>
           </w:p>
         </w:tc>
@@ -2529,7 +2529,7 @@
                 <w:color w:val="282828"/>
                 <w:sz w:val="20"/>
               </w:rPr>
-              <w:t>Nhập lô hàng từ Kho tổng</w:t>
+              <w:t>Tiếp nhận &amp; Nhập lô từ Kho tổng</w:t>
             </w:r>
           </w:p>
         </w:tc>
@@ -2579,7 +2579,7 @@
                 <w:color w:val="282828"/>
                 <w:sz w:val="20"/>
               </w:rPr>
-              <w:t>Ghi nhận đợt hàng về, lưu thông tin lô và số lượng vào kho D1.</w:t>
+              <w:t>Kiểm đếm HSD thực tế, lưu thông tin lô, kích hoạt Shelf-life, in tem nhãn kệ.</w:t>
             </w:r>
           </w:p>
         </w:tc>
@@ -2656,7 +2656,315 @@
                 <w:color w:val="282828"/>
                 <w:sz w:val="20"/>
               </w:rPr>
-              <w:t>Nhập sản phẩm bán, hệ thống tự động trừ tồn của lô có HSD gần nhất.</w:t>
+              <w:t>Quét mã vạch POS, tự động quét chọn lô HSD gần nhất trừ tồn, lưu lịch sử và biến thời tiết/lễ.</w:t>
+            </w:r>
+          </w:p>
+        </w:tc>
+      </w:tr>
+      <w:tr>
+        <w:tc>
+          <w:tcPr>
+            <w:tcW w:type="dxa" w:w="2592"/>
+            <w:shd w:fill="F2F5F8"/>
+            <w:tcMar>
+              <w:top w:w="100" w:type="dxa"/>
+              <w:bottom w:w="100" w:type="dxa"/>
+              <w:left w:w="120" w:type="dxa"/>
+              <w:right w:w="120" w:type="dxa"/>
+            </w:tcMar>
+          </w:tcPr>
+          <w:p>
+            <w:pPr>
+              <w:jc w:val="center"/>
+            </w:pPr>
+            <w:r>
+              <w:rPr>
+                <w:rFonts w:ascii="Times New Roman" w:hAnsi="Times New Roman"/>
+                <w:color w:val="282828"/>
+                <w:sz w:val="20"/>
+              </w:rPr>
+              <w:t>Giám sát HSD &amp; Cảnh báo Spoilage</w:t>
+            </w:r>
+          </w:p>
+        </w:tc>
+        <w:tc>
+          <w:tcPr>
+            <w:tcW w:type="dxa" w:w="1728"/>
+            <w:shd w:fill="F2F5F8"/>
+            <w:tcMar>
+              <w:top w:w="100" w:type="dxa"/>
+              <w:bottom w:w="100" w:type="dxa"/>
+              <w:left w:w="120" w:type="dxa"/>
+              <w:right w:w="120" w:type="dxa"/>
+            </w:tcMar>
+          </w:tcPr>
+          <w:p>
+            <w:pPr>
+              <w:jc w:val="left"/>
+            </w:pPr>
+            <w:r>
+              <w:rPr>
+                <w:rFonts w:ascii="Times New Roman" w:hAnsi="Times New Roman"/>
+                <w:color w:val="282828"/>
+                <w:sz w:val="20"/>
+              </w:rPr>
+              <w:t>Staff, Manager</w:t>
+            </w:r>
+          </w:p>
+        </w:tc>
+        <w:tc>
+          <w:tcPr>
+            <w:tcW w:type="dxa" w:w="5040"/>
+            <w:shd w:fill="F2F5F8"/>
+            <w:tcMar>
+              <w:top w:w="100" w:type="dxa"/>
+              <w:bottom w:w="100" w:type="dxa"/>
+              <w:left w:w="120" w:type="dxa"/>
+              <w:right w:w="120" w:type="dxa"/>
+            </w:tcMar>
+          </w:tcPr>
+          <w:p>
+            <w:pPr>
+              <w:jc w:val="left"/>
+            </w:pPr>
+            <w:r>
+              <w:rPr>
+                <w:rFonts w:ascii="Times New Roman" w:hAnsi="Times New Roman"/>
+                <w:color w:val="282828"/>
+                <w:sz w:val="20"/>
+              </w:rPr>
+              <w:t>Quét tự động đếm lùi ngày HSD, phân loại 3 mức RSL, đảo hàng, dán tem giảm giá, khóa mã khi hết hạn.</w:t>
+            </w:r>
+          </w:p>
+        </w:tc>
+      </w:tr>
+      <w:tr>
+        <w:tc>
+          <w:tcPr>
+            <w:tcW w:type="dxa" w:w="2592"/>
+            <w:shd w:fill="FFFFFF"/>
+            <w:tcMar>
+              <w:top w:w="100" w:type="dxa"/>
+              <w:bottom w:w="100" w:type="dxa"/>
+              <w:left w:w="120" w:type="dxa"/>
+              <w:right w:w="120" w:type="dxa"/>
+            </w:tcMar>
+          </w:tcPr>
+          <w:p>
+            <w:pPr>
+              <w:jc w:val="center"/>
+            </w:pPr>
+            <w:r>
+              <w:rPr>
+                <w:rFonts w:ascii="Times New Roman" w:hAnsi="Times New Roman"/>
+                <w:color w:val="282828"/>
+                <w:sz w:val="20"/>
+              </w:rPr>
+              <w:t>Quy trình Tiêu hủy hàng hỏng</w:t>
+            </w:r>
+          </w:p>
+        </w:tc>
+        <w:tc>
+          <w:tcPr>
+            <w:tcW w:type="dxa" w:w="1728"/>
+            <w:shd w:fill="FFFFFF"/>
+            <w:tcMar>
+              <w:top w:w="100" w:type="dxa"/>
+              <w:bottom w:w="100" w:type="dxa"/>
+              <w:left w:w="120" w:type="dxa"/>
+              <w:right w:w="120" w:type="dxa"/>
+            </w:tcMar>
+          </w:tcPr>
+          <w:p>
+            <w:pPr>
+              <w:jc w:val="left"/>
+            </w:pPr>
+            <w:r>
+              <w:rPr>
+                <w:rFonts w:ascii="Times New Roman" w:hAnsi="Times New Roman"/>
+                <w:color w:val="282828"/>
+                <w:sz w:val="20"/>
+              </w:rPr>
+              <w:t>Staff, Manager</w:t>
+            </w:r>
+          </w:p>
+        </w:tc>
+        <w:tc>
+          <w:tcPr>
+            <w:tcW w:type="dxa" w:w="5040"/>
+            <w:shd w:fill="FFFFFF"/>
+            <w:tcMar>
+              <w:top w:w="100" w:type="dxa"/>
+              <w:bottom w:w="100" w:type="dxa"/>
+              <w:left w:w="120" w:type="dxa"/>
+              <w:right w:w="120" w:type="dxa"/>
+            </w:tcMar>
+          </w:tcPr>
+          <w:p>
+            <w:pPr>
+              <w:jc w:val="left"/>
+            </w:pPr>
+            <w:r>
+              <w:rPr>
+                <w:rFonts w:ascii="Times New Roman" w:hAnsi="Times New Roman"/>
+                <w:color w:val="282828"/>
+                <w:sz w:val="20"/>
+              </w:rPr>
+              <w:t>Nhân viên lập phiếu hủy, Quản lý duyệt, hệ thống trừ tồn về 0 và hạch toán thiệt hại tài chính.</w:t>
+            </w:r>
+          </w:p>
+        </w:tc>
+      </w:tr>
+      <w:tr>
+        <w:tc>
+          <w:tcPr>
+            <w:tcW w:type="dxa" w:w="2592"/>
+            <w:shd w:fill="F2F5F8"/>
+            <w:tcMar>
+              <w:top w:w="100" w:type="dxa"/>
+              <w:bottom w:w="100" w:type="dxa"/>
+              <w:left w:w="120" w:type="dxa"/>
+              <w:right w:w="120" w:type="dxa"/>
+            </w:tcMar>
+          </w:tcPr>
+          <w:p>
+            <w:pPr>
+              <w:jc w:val="center"/>
+            </w:pPr>
+            <w:r>
+              <w:rPr>
+                <w:rFonts w:ascii="Times New Roman" w:hAnsi="Times New Roman"/>
+                <w:color w:val="282828"/>
+                <w:sz w:val="20"/>
+              </w:rPr>
+              <w:t>Dự báo &amp; Đề xuất Đặt hàng</w:t>
+            </w:r>
+          </w:p>
+        </w:tc>
+        <w:tc>
+          <w:tcPr>
+            <w:tcW w:type="dxa" w:w="1728"/>
+            <w:shd w:fill="F2F5F8"/>
+            <w:tcMar>
+              <w:top w:w="100" w:type="dxa"/>
+              <w:bottom w:w="100" w:type="dxa"/>
+              <w:left w:w="120" w:type="dxa"/>
+              <w:right w:w="120" w:type="dxa"/>
+            </w:tcMar>
+          </w:tcPr>
+          <w:p>
+            <w:pPr>
+              <w:jc w:val="left"/>
+            </w:pPr>
+            <w:r>
+              <w:rPr>
+                <w:rFonts w:ascii="Times New Roman" w:hAnsi="Times New Roman"/>
+                <w:color w:val="282828"/>
+                <w:sz w:val="20"/>
+              </w:rPr>
+              <w:t>Manager, DC</w:t>
+            </w:r>
+          </w:p>
+        </w:tc>
+        <w:tc>
+          <w:tcPr>
+            <w:tcW w:type="dxa" w:w="5040"/>
+            <w:shd w:fill="F2F5F8"/>
+            <w:tcMar>
+              <w:top w:w="100" w:type="dxa"/>
+              <w:bottom w:w="100" w:type="dxa"/>
+              <w:left w:w="120" w:type="dxa"/>
+              <w:right w:w="120" w:type="dxa"/>
+            </w:tcMar>
+          </w:tcPr>
+          <w:p>
+            <w:pPr>
+              <w:jc w:val="left"/>
+            </w:pPr>
+            <w:r>
+              <w:rPr>
+                <w:rFonts w:ascii="Times New Roman" w:hAnsi="Times New Roman"/>
+                <w:color w:val="282828"/>
+                <w:sz w:val="20"/>
+              </w:rPr>
+              <w:t>Phân tích tốc độ bán d và hệ số K, tính ROP, cảnh báo DOS&gt;DUE, sinh đề xuất và gửi đơn về Kho tổng.</w:t>
+            </w:r>
+          </w:p>
+        </w:tc>
+      </w:tr>
+      <w:tr>
+        <w:tc>
+          <w:tcPr>
+            <w:tcW w:type="dxa" w:w="2592"/>
+            <w:shd w:fill="FFFFFF"/>
+            <w:tcMar>
+              <w:top w:w="100" w:type="dxa"/>
+              <w:bottom w:w="100" w:type="dxa"/>
+              <w:left w:w="120" w:type="dxa"/>
+              <w:right w:w="120" w:type="dxa"/>
+            </w:tcMar>
+          </w:tcPr>
+          <w:p>
+            <w:pPr>
+              <w:jc w:val="center"/>
+            </w:pPr>
+            <w:r>
+              <w:rPr>
+                <w:rFonts w:ascii="Times New Roman" w:hAnsi="Times New Roman"/>
+                <w:color w:val="282828"/>
+                <w:sz w:val="20"/>
+              </w:rPr>
+              <w:t>Quản lý Danh mục &amp; Cấu hình</w:t>
+            </w:r>
+          </w:p>
+        </w:tc>
+        <w:tc>
+          <w:tcPr>
+            <w:tcW w:type="dxa" w:w="1728"/>
+            <w:shd w:fill="FFFFFF"/>
+            <w:tcMar>
+              <w:top w:w="100" w:type="dxa"/>
+              <w:bottom w:w="100" w:type="dxa"/>
+              <w:left w:w="120" w:type="dxa"/>
+              <w:right w:w="120" w:type="dxa"/>
+            </w:tcMar>
+          </w:tcPr>
+          <w:p>
+            <w:pPr>
+              <w:jc w:val="center"/>
+            </w:pPr>
+            <w:r>
+              <w:rPr>
+                <w:rFonts w:ascii="Times New Roman" w:hAnsi="Times New Roman"/>
+                <w:color w:val="282828"/>
+                <w:sz w:val="20"/>
+              </w:rPr>
+              <w:t>Manager</w:t>
+            </w:r>
+          </w:p>
+        </w:tc>
+        <w:tc>
+          <w:tcPr>
+            <w:tcW w:type="dxa" w:w="5040"/>
+            <w:shd w:fill="FFFFFF"/>
+            <w:tcMar>
+              <w:top w:w="100" w:type="dxa"/>
+              <w:bottom w:w="100" w:type="dxa"/>
+              <w:left w:w="120" w:type="dxa"/>
+              <w:right w:w="120" w:type="dxa"/>
+            </w:tcMar>
+          </w:tcPr>
+          <w:p>
+            <w:pPr>
+              <w:jc w:val="left"/>
+            </w:pPr>
+            <w:r>
+              <w:rPr>
+                <w:rFonts w:ascii="Times New Roman" w:hAnsi="Times New Roman"/>
+                <w:color w:val="282828"/>
+                <w:sz w:val="20"/>
+              </w:rPr>
+              <w:t>CRUD sản phẩm, cấu hình số ngày cảnh báo cận date riêng từng nhóm hàng và tồn kho an toàn.</w:t>
             </w:r>
           </w:p>
         </w:tc>
@@ -2733,7 +3041,7 @@
                 <w:color w:val="282828"/>
                 <w:sz w:val="20"/>
               </w:rPr>
-              <w:t>Đọc file Excel bán hàng và nạp hàng loạt vào kho dữ liệu bán hàng D2.</w:t>
+              <w:t>Đọc file Excel bán hàng và nạp hàng loạt vào kho dữ liệu bán hàng.</w:t>
             </w:r>
           </w:p>
         </w:tc>
@@ -2760,161 +3068,7 @@
                 <w:color w:val="282828"/>
                 <w:sz w:val="20"/>
               </w:rPr>
-              <w:t>Theo dõi HSD &amp; Cảnh báo</w:t>
-            </w:r>
-          </w:p>
-        </w:tc>
-        <w:tc>
-          <w:tcPr>
-            <w:tcW w:type="dxa" w:w="1728"/>
-            <w:shd w:fill="FFFFFF"/>
-            <w:tcMar>
-              <w:top w:w="100" w:type="dxa"/>
-              <w:bottom w:w="100" w:type="dxa"/>
-              <w:left w:w="120" w:type="dxa"/>
-              <w:right w:w="120" w:type="dxa"/>
-            </w:tcMar>
-          </w:tcPr>
-          <w:p>
-            <w:pPr>
-              <w:jc w:val="left"/>
-            </w:pPr>
-            <w:r>
-              <w:rPr>
-                <w:rFonts w:ascii="Times New Roman" w:hAnsi="Times New Roman"/>
-                <w:color w:val="282828"/>
-                <w:sz w:val="20"/>
-              </w:rPr>
-              <w:t>Staff, Manager</w:t>
-            </w:r>
-          </w:p>
-        </w:tc>
-        <w:tc>
-          <w:tcPr>
-            <w:tcW w:type="dxa" w:w="5040"/>
-            <w:shd w:fill="FFFFFF"/>
-            <w:tcMar>
-              <w:top w:w="100" w:type="dxa"/>
-              <w:bottom w:w="100" w:type="dxa"/>
-              <w:left w:w="120" w:type="dxa"/>
-              <w:right w:w="120" w:type="dxa"/>
-            </w:tcMar>
-          </w:tcPr>
-          <w:p>
-            <w:pPr>
-              <w:jc w:val="left"/>
-            </w:pPr>
-            <w:r>
-              <w:rPr>
-                <w:rFonts w:ascii="Times New Roman" w:hAnsi="Times New Roman"/>
-                <w:color w:val="282828"/>
-                <w:sz w:val="20"/>
-              </w:rPr>
-              <w:t>Hệ thống tự động tính ngày còn lại và hiển thị cảnh báo Đỏ/Vàng.</w:t>
-            </w:r>
-          </w:p>
-        </w:tc>
-      </w:tr>
-      <w:tr>
-        <w:tc>
-          <w:tcPr>
-            <w:tcW w:type="dxa" w:w="2592"/>
-            <w:shd w:fill="F2F5F8"/>
-            <w:tcMar>
-              <w:top w:w="100" w:type="dxa"/>
-              <w:bottom w:w="100" w:type="dxa"/>
-              <w:left w:w="120" w:type="dxa"/>
-              <w:right w:w="120" w:type="dxa"/>
-            </w:tcMar>
-          </w:tcPr>
-          <w:p>
-            <w:pPr>
-              <w:jc w:val="center"/>
-            </w:pPr>
-            <w:r>
-              <w:rPr>
-                <w:rFonts w:ascii="Times New Roman" w:hAnsi="Times New Roman"/>
-                <w:color w:val="282828"/>
-                <w:sz w:val="20"/>
-              </w:rPr>
-              <w:t>Ghi nhận tiêu hủy hàng</w:t>
-            </w:r>
-          </w:p>
-        </w:tc>
-        <w:tc>
-          <w:tcPr>
-            <w:tcW w:type="dxa" w:w="1728"/>
-            <w:shd w:fill="F2F5F8"/>
-            <w:tcMar>
-              <w:top w:w="100" w:type="dxa"/>
-              <w:bottom w:w="100" w:type="dxa"/>
-              <w:left w:w="120" w:type="dxa"/>
-              <w:right w:w="120" w:type="dxa"/>
-            </w:tcMar>
-          </w:tcPr>
-          <w:p>
-            <w:pPr>
-              <w:jc w:val="center"/>
-            </w:pPr>
-            <w:r>
-              <w:rPr>
-                <w:rFonts w:ascii="Times New Roman" w:hAnsi="Times New Roman"/>
-                <w:color w:val="282828"/>
-                <w:sz w:val="20"/>
-              </w:rPr>
-              <w:t>Staff</w:t>
-            </w:r>
-          </w:p>
-        </w:tc>
-        <w:tc>
-          <w:tcPr>
-            <w:tcW w:type="dxa" w:w="5040"/>
-            <w:shd w:fill="F2F5F8"/>
-            <w:tcMar>
-              <w:top w:w="100" w:type="dxa"/>
-              <w:bottom w:w="100" w:type="dxa"/>
-              <w:left w:w="120" w:type="dxa"/>
-              <w:right w:w="120" w:type="dxa"/>
-            </w:tcMar>
-          </w:tcPr>
-          <w:p>
-            <w:pPr>
-              <w:jc w:val="left"/>
-            </w:pPr>
-            <w:r>
-              <w:rPr>
-                <w:rFonts w:ascii="Times New Roman" w:hAnsi="Times New Roman"/>
-                <w:color w:val="282828"/>
-                <w:sz w:val="20"/>
-              </w:rPr>
-              <w:t>Xác nhận hủy lô quá hạn, đưa tồn về 0 và ghi sổ hao hụt D3.</w:t>
-            </w:r>
-          </w:p>
-        </w:tc>
-      </w:tr>
-      <w:tr>
-        <w:tc>
-          <w:tcPr>
-            <w:tcW w:type="dxa" w:w="2592"/>
-            <w:shd w:fill="FFFFFF"/>
-            <w:tcMar>
-              <w:top w:w="100" w:type="dxa"/>
-              <w:bottom w:w="100" w:type="dxa"/>
-              <w:left w:w="120" w:type="dxa"/>
-              <w:right w:w="120" w:type="dxa"/>
-            </w:tcMar>
-          </w:tcPr>
-          <w:p>
-            <w:pPr>
-              <w:jc w:val="center"/>
-            </w:pPr>
-            <w:r>
-              <w:rPr>
-                <w:rFonts w:ascii="Times New Roman" w:hAnsi="Times New Roman"/>
-                <w:color w:val="282828"/>
-                <w:sz w:val="20"/>
-              </w:rPr>
-              <w:t>Xem đề xuất đặt hàng</w:t>
+              <w:t>Dashboard Thống kê &amp; Báo cáo</w:t>
             </w:r>
           </w:p>
         </w:tc>
@@ -2964,161 +3118,7 @@
                 <w:color w:val="282828"/>
                 <w:sz w:val="20"/>
               </w:rPr>
-              <w:t>Xem danh sách gợi ý số lượng cần đặt từ Kho tổng dựa trên ROP và mùa vụ.</w:t>
-            </w:r>
-          </w:p>
-        </w:tc>
-      </w:tr>
-      <w:tr>
-        <w:tc>
-          <w:tcPr>
-            <w:tcW w:type="dxa" w:w="2592"/>
-            <w:shd w:fill="F2F5F8"/>
-            <w:tcMar>
-              <w:top w:w="100" w:type="dxa"/>
-              <w:bottom w:w="100" w:type="dxa"/>
-              <w:left w:w="120" w:type="dxa"/>
-              <w:right w:w="120" w:type="dxa"/>
-            </w:tcMar>
-          </w:tcPr>
-          <w:p>
-            <w:pPr>
-              <w:jc w:val="center"/>
-            </w:pPr>
-            <w:r>
-              <w:rPr>
-                <w:rFonts w:ascii="Times New Roman" w:hAnsi="Times New Roman"/>
-                <w:color w:val="282828"/>
-                <w:sz w:val="20"/>
-              </w:rPr>
-              <w:t>Xem Dashboard &amp; Báo cáo</w:t>
-            </w:r>
-          </w:p>
-        </w:tc>
-        <w:tc>
-          <w:tcPr>
-            <w:tcW w:type="dxa" w:w="1728"/>
-            <w:shd w:fill="F2F5F8"/>
-            <w:tcMar>
-              <w:top w:w="100" w:type="dxa"/>
-              <w:bottom w:w="100" w:type="dxa"/>
-              <w:left w:w="120" w:type="dxa"/>
-              <w:right w:w="120" w:type="dxa"/>
-            </w:tcMar>
-          </w:tcPr>
-          <w:p>
-            <w:pPr>
-              <w:jc w:val="center"/>
-            </w:pPr>
-            <w:r>
-              <w:rPr>
-                <w:rFonts w:ascii="Times New Roman" w:hAnsi="Times New Roman"/>
-                <w:color w:val="282828"/>
-                <w:sz w:val="20"/>
-              </w:rPr>
-              <w:t>Manager</w:t>
-            </w:r>
-          </w:p>
-        </w:tc>
-        <w:tc>
-          <w:tcPr>
-            <w:tcW w:type="dxa" w:w="5040"/>
-            <w:shd w:fill="F2F5F8"/>
-            <w:tcMar>
-              <w:top w:w="100" w:type="dxa"/>
-              <w:bottom w:w="100" w:type="dxa"/>
-              <w:left w:w="120" w:type="dxa"/>
-              <w:right w:w="120" w:type="dxa"/>
-            </w:tcMar>
-          </w:tcPr>
-          <w:p>
-            <w:pPr>
-              <w:jc w:val="left"/>
-            </w:pPr>
-            <w:r>
-              <w:rPr>
-                <w:rFonts w:ascii="Times New Roman" w:hAnsi="Times New Roman"/>
-                <w:color w:val="282828"/>
-                <w:sz w:val="20"/>
-              </w:rPr>
-              <w:t>Xem biểu đồ doanh thu, tỷ lệ hao hụt hàng hóa và xuất báo cáo định kỳ.</w:t>
-            </w:r>
-          </w:p>
-        </w:tc>
-      </w:tr>
-      <w:tr>
-        <w:tc>
-          <w:tcPr>
-            <w:tcW w:type="dxa" w:w="2592"/>
-            <w:shd w:fill="FFFFFF"/>
-            <w:tcMar>
-              <w:top w:w="100" w:type="dxa"/>
-              <w:bottom w:w="100" w:type="dxa"/>
-              <w:left w:w="120" w:type="dxa"/>
-              <w:right w:w="120" w:type="dxa"/>
-            </w:tcMar>
-          </w:tcPr>
-          <w:p>
-            <w:pPr>
-              <w:jc w:val="center"/>
-            </w:pPr>
-            <w:r>
-              <w:rPr>
-                <w:rFonts w:ascii="Times New Roman" w:hAnsi="Times New Roman"/>
-                <w:color w:val="282828"/>
-                <w:sz w:val="20"/>
-              </w:rPr>
-              <w:t>Quản lý danh mục &amp; Ngưỡng</w:t>
-            </w:r>
-          </w:p>
-        </w:tc>
-        <w:tc>
-          <w:tcPr>
-            <w:tcW w:type="dxa" w:w="1728"/>
-            <w:shd w:fill="FFFFFF"/>
-            <w:tcMar>
-              <w:top w:w="100" w:type="dxa"/>
-              <w:bottom w:w="100" w:type="dxa"/>
-              <w:left w:w="120" w:type="dxa"/>
-              <w:right w:w="120" w:type="dxa"/>
-            </w:tcMar>
-          </w:tcPr>
-          <w:p>
-            <w:pPr>
-              <w:jc w:val="center"/>
-            </w:pPr>
-            <w:r>
-              <w:rPr>
-                <w:rFonts w:ascii="Times New Roman" w:hAnsi="Times New Roman"/>
-                <w:color w:val="282828"/>
-                <w:sz w:val="20"/>
-              </w:rPr>
-              <w:t>Manager</w:t>
-            </w:r>
-          </w:p>
-        </w:tc>
-        <w:tc>
-          <w:tcPr>
-            <w:tcW w:type="dxa" w:w="5040"/>
-            <w:shd w:fill="FFFFFF"/>
-            <w:tcMar>
-              <w:top w:w="100" w:type="dxa"/>
-              <w:bottom w:w="100" w:type="dxa"/>
-              <w:left w:w="120" w:type="dxa"/>
-              <w:right w:w="120" w:type="dxa"/>
-            </w:tcMar>
-          </w:tcPr>
-          <w:p>
-            <w:pPr>
-              <w:jc w:val="left"/>
-            </w:pPr>
-            <w:r>
-              <w:rPr>
-                <w:rFonts w:ascii="Times New Roman" w:hAnsi="Times New Roman"/>
-                <w:color w:val="282828"/>
-                <w:sz w:val="20"/>
-              </w:rPr>
-              <w:t>Thêm/sửa sản phẩm, đơn vị tính và cấu hình số ngày cảnh báo cận date.</w:t>
+              <w:t>Xem biểu đồ doanh thu, tỷ lệ hao hụt hàng hóa (Spoilage Rate %) và xuất báo cáo kiểm kê định kỳ.</w:t>
             </w:r>
           </w:p>
         </w:tc>

</xml_diff>

<commit_message>
feat: Dong bo toan dien bo 3 so do Use Case, DFD 0 va DFD 1 cung phong cach truc quan do net cao chuan retail
</commit_message>
<xml_diff>
--- a/Docs/BAO_CAO_NGHIEP_VU_VA_KIEN_TRUC_NOP_THAY.docx
+++ b/Docs/BAO_CAO_NGHIEP_VU_VA_KIEN_TRUC_NOP_THAY.docx
@@ -3147,7 +3147,7 @@
       <w:r>
         <w:drawing>
           <wp:inline xmlns:a="http://schemas.openxmlformats.org/drawingml/2006/main" xmlns:pic="http://schemas.openxmlformats.org/drawingml/2006/picture">
-            <wp:extent cx="5303520" cy="6994321"/>
+            <wp:extent cx="5303520" cy="3849290"/>
             <wp:docPr id="2" name="Picture 2"/>
             <wp:cNvGraphicFramePr>
               <a:graphicFrameLocks noChangeAspect="1"/>
@@ -3168,7 +3168,7 @@
                   <pic:spPr>
                     <a:xfrm>
                       <a:off x="0" y="0"/>
-                      <a:ext cx="5303520" cy="6994321"/>
+                      <a:ext cx="5303520" cy="3849290"/>
                     </a:xfrm>
                     <a:prstGeom prst="rect"/>
                   </pic:spPr>
@@ -3273,7 +3273,7 @@
       <w:r>
         <w:drawing>
           <wp:inline xmlns:a="http://schemas.openxmlformats.org/drawingml/2006/main" xmlns:pic="http://schemas.openxmlformats.org/drawingml/2006/picture">
-            <wp:extent cx="5303520" cy="2642950"/>
+            <wp:extent cx="5303520" cy="6532135"/>
             <wp:docPr id="3" name="Picture 3"/>
             <wp:cNvGraphicFramePr>
               <a:graphicFrameLocks noChangeAspect="1"/>
@@ -3294,7 +3294,7 @@
                   <pic:spPr>
                     <a:xfrm>
                       <a:off x="0" y="0"/>
-                      <a:ext cx="5303520" cy="2642950"/>
+                      <a:ext cx="5303520" cy="6532135"/>
                     </a:xfrm>
                     <a:prstGeom prst="rect"/>
                   </pic:spPr>

</xml_diff>